<commit_message>
modificaciones a documento de entrega
</commit_message>
<xml_diff>
--- a/diagrams/Diagramas_LeerArchivo.docx
+++ b/diagrams/Diagramas_LeerArchivo.docx
@@ -69,7 +69,13 @@
         <w:jc w:val="center"/>
       </w:pPr>
       <w:r>
-        <w:t>Ejercicio 6.8 — Lectura de archivos: Diagramas de la clase LeerArchivo</w:t>
+        <w:t>Ejercicio 6.8</w:t>
+      </w:r>
+      <w:r>
+        <w:t>.</w:t>
+      </w:r>
+      <w:r>
+        <w:t xml:space="preserve"> Lectura de archivos: Diagramas de la clase LeerArchivo</w:t>
       </w:r>
     </w:p>
     <w:p>
@@ -104,12 +110,6 @@
         <w:lastRenderedPageBreak/>
         <w:t>Diagrama de clases</w:t>
       </w:r>
-    </w:p>
-    <w:p>
-      <w:pPr>
-        <w:spacing w:after="160"/>
-        <w:jc w:val="center"/>
-      </w:pPr>
       <w:r>
         <w:rPr>
           <w:noProof/>
@@ -167,19 +167,13 @@
         <w:pStyle w:val="Heading2"/>
       </w:pPr>
       <w:r>
+        <w:lastRenderedPageBreak/>
         <w:t>Diagrama de casos de uso</w:t>
       </w:r>
-    </w:p>
-    <w:p>
-      <w:pPr>
-        <w:spacing w:after="160"/>
-        <w:jc w:val="center"/>
-      </w:pPr>
       <w:r>
         <w:rPr>
           <w:noProof/>
         </w:rPr>
-        <w:lastRenderedPageBreak/>
         <w:drawing>
           <wp:inline distT="0" distB="0" distL="0" distR="0" wp14:anchorId="6563608C" wp14:editId="307BC482">
             <wp:extent cx="5143500" cy="3209925"/>
@@ -225,6 +219,21 @@
         <w:t>El actor Usuario interactúa con tres casos de uso principales: Seleccionar archivo de texto, mediante el cual el usuario elige el archivo .txt a leer; Leer contenido del archivo, en el que se ejecuta la lógica de lectura basada en FileInputStream, InputStreamReader y BufferedReader; y Visualizar contenido en pantalla, donde el contenido leído se muestra en el área de texto de la aplicación. Estos casos de uso representan el flujo de trabajo implementado por la aplicación Swing LeerArchivoGUI.</w:t>
       </w:r>
     </w:p>
+    <w:p/>
+    <w:p>
+      <w:r>
+        <w:t xml:space="preserve">Link a Repositorio: </w:t>
+      </w:r>
+      <w:hyperlink r:id="rId8" w:history="1">
+        <w:r>
+          <w:rPr>
+            <w:rStyle w:val="Hyperlink"/>
+          </w:rPr>
+          <w:t>https://github.com/irojasu-jpg/Ejercicio-LeerArchivo.git</w:t>
+        </w:r>
+      </w:hyperlink>
+    </w:p>
+    <w:p/>
     <w:sectPr>
       <w:pgSz w:w="12240" w:h="15840"/>
       <w:pgMar w:top="1440" w:right="1440" w:bottom="1440" w:left="1440" w:header="708" w:footer="708" w:gutter="0"/>
@@ -931,6 +940,18 @@
       <w:szCs w:val="20"/>
     </w:rPr>
   </w:style>
+  <w:style w:type="character" w:styleId="UnresolvedMention">
+    <w:name w:val="Unresolved Mention"/>
+    <w:basedOn w:val="DefaultParagraphFont"/>
+    <w:uiPriority w:val="99"/>
+    <w:semiHidden/>
+    <w:unhideWhenUsed/>
+    <w:rsid w:val="00E462C1"/>
+    <w:rPr>
+      <w:color w:val="605E5C"/>
+      <w:shd w:val="clear" w:color="auto" w:fill="E1DFDD"/>
+    </w:rPr>
+  </w:style>
 </w:styles>
 </file>
 

</xml_diff>